<commit_message>
Initial DBIM Auditor commit
</commit_message>
<xml_diff>
--- a/reports/final_report.docx
+++ b/reports/final_report.docx
@@ -12,7 +12,7 @@
     </w:p>
     <w:p>
       <w:r>
-        <w:t>Generated On: 2026-05-25 10:35:20</w:t>
+        <w:t>Generated On: 2026-05-25 14:01:05</w:t>
       </w:r>
     </w:p>
     <w:p>
@@ -158,7 +158,7 @@
       <w:r>
         <w:drawing>
           <wp:inline xmlns:a="http://schemas.openxmlformats.org/drawingml/2006/main" xmlns:pic="http://schemas.openxmlformats.org/drawingml/2006/picture">
-            <wp:extent cx="5303520" cy="14382115"/>
+            <wp:extent cx="5303520" cy="12912598"/>
             <wp:docPr id="3" name="Picture 3"/>
             <wp:cNvGraphicFramePr>
               <a:graphicFrameLocks noChangeAspect="1"/>
@@ -179,7 +179,7 @@
                   <pic:spPr>
                     <a:xfrm>
                       <a:off x="0" y="0"/>
-                      <a:ext cx="5303520" cy="14382115"/>
+                      <a:ext cx="5303520" cy="12912598"/>
                     </a:xfrm>
                     <a:prstGeom prst="rect"/>
                   </pic:spPr>
@@ -212,7 +212,7 @@
       <w:r>
         <w:drawing>
           <wp:inline xmlns:a="http://schemas.openxmlformats.org/drawingml/2006/main" xmlns:pic="http://schemas.openxmlformats.org/drawingml/2006/picture">
-            <wp:extent cx="5303520" cy="3410458"/>
+            <wp:extent cx="5303520" cy="13907008"/>
             <wp:docPr id="4" name="Picture 4"/>
             <wp:cNvGraphicFramePr>
               <a:graphicFrameLocks noChangeAspect="1"/>
@@ -233,7 +233,7 @@
                   <pic:spPr>
                     <a:xfrm>
                       <a:off x="0" y="0"/>
-                      <a:ext cx="5303520" cy="3410458"/>
+                      <a:ext cx="5303520" cy="13907008"/>
                     </a:xfrm>
                     <a:prstGeom prst="rect"/>
                   </pic:spPr>
@@ -266,7 +266,7 @@
       <w:r>
         <w:drawing>
           <wp:inline xmlns:a="http://schemas.openxmlformats.org/drawingml/2006/main" xmlns:pic="http://schemas.openxmlformats.org/drawingml/2006/picture">
-            <wp:extent cx="5303520" cy="3410458"/>
+            <wp:extent cx="5303520" cy="13907008"/>
             <wp:docPr id="5" name="Picture 5"/>
             <wp:cNvGraphicFramePr>
               <a:graphicFrameLocks noChangeAspect="1"/>
@@ -287,7 +287,7 @@
                   <pic:spPr>
                     <a:xfrm>
                       <a:off x="0" y="0"/>
-                      <a:ext cx="5303520" cy="3410458"/>
+                      <a:ext cx="5303520" cy="13907008"/>
                     </a:xfrm>
                     <a:prstGeom prst="rect"/>
                   </pic:spPr>
@@ -333,7 +333,7 @@
       <w:r>
         <w:drawing>
           <wp:inline xmlns:a="http://schemas.openxmlformats.org/drawingml/2006/main" xmlns:pic="http://schemas.openxmlformats.org/drawingml/2006/picture">
-            <wp:extent cx="5303520" cy="4412234"/>
+            <wp:extent cx="5303520" cy="4489577"/>
             <wp:docPr id="6" name="Picture 6"/>
             <wp:cNvGraphicFramePr>
               <a:graphicFrameLocks noChangeAspect="1"/>
@@ -354,7 +354,7 @@
                   <pic:spPr>
                     <a:xfrm>
                       <a:off x="0" y="0"/>
-                      <a:ext cx="5303520" cy="4412234"/>
+                      <a:ext cx="5303520" cy="4489577"/>
                     </a:xfrm>
                     <a:prstGeom prst="rect"/>
                   </pic:spPr>
@@ -387,7 +387,7 @@
       <w:r>
         <w:drawing>
           <wp:inline xmlns:a="http://schemas.openxmlformats.org/drawingml/2006/main" xmlns:pic="http://schemas.openxmlformats.org/drawingml/2006/picture">
-            <wp:extent cx="5303520" cy="4412234"/>
+            <wp:extent cx="5303520" cy="4489577"/>
             <wp:docPr id="7" name="Picture 7"/>
             <wp:cNvGraphicFramePr>
               <a:graphicFrameLocks noChangeAspect="1"/>
@@ -408,7 +408,7 @@
                   <pic:spPr>
                     <a:xfrm>
                       <a:off x="0" y="0"/>
-                      <a:ext cx="5303520" cy="4412234"/>
+                      <a:ext cx="5303520" cy="4489577"/>
                     </a:xfrm>
                     <a:prstGeom prst="rect"/>
                   </pic:spPr>
@@ -454,7 +454,7 @@
       <w:r>
         <w:drawing>
           <wp:inline xmlns:a="http://schemas.openxmlformats.org/drawingml/2006/main" xmlns:pic="http://schemas.openxmlformats.org/drawingml/2006/picture">
-            <wp:extent cx="5303520" cy="4412234"/>
+            <wp:extent cx="5303520" cy="4489577"/>
             <wp:docPr id="8" name="Picture 8"/>
             <wp:cNvGraphicFramePr>
               <a:graphicFrameLocks noChangeAspect="1"/>
@@ -475,7 +475,7 @@
                   <pic:spPr>
                     <a:xfrm>
                       <a:off x="0" y="0"/>
-                      <a:ext cx="5303520" cy="4412234"/>
+                      <a:ext cx="5303520" cy="4489577"/>
                     </a:xfrm>
                     <a:prstGeom prst="rect"/>
                   </pic:spPr>
@@ -508,7 +508,7 @@
       <w:r>
         <w:drawing>
           <wp:inline xmlns:a="http://schemas.openxmlformats.org/drawingml/2006/main" xmlns:pic="http://schemas.openxmlformats.org/drawingml/2006/picture">
-            <wp:extent cx="5303520" cy="4412234"/>
+            <wp:extent cx="5303520" cy="4489577"/>
             <wp:docPr id="9" name="Picture 9"/>
             <wp:cNvGraphicFramePr>
               <a:graphicFrameLocks noChangeAspect="1"/>
@@ -529,7 +529,7 @@
                   <pic:spPr>
                     <a:xfrm>
                       <a:off x="0" y="0"/>
-                      <a:ext cx="5303520" cy="4412234"/>
+                      <a:ext cx="5303520" cy="4489577"/>
                     </a:xfrm>
                     <a:prstGeom prst="rect"/>
                   </pic:spPr>
@@ -562,7 +562,7 @@
       <w:r>
         <w:drawing>
           <wp:inline xmlns:a="http://schemas.openxmlformats.org/drawingml/2006/main" xmlns:pic="http://schemas.openxmlformats.org/drawingml/2006/picture">
-            <wp:extent cx="5303520" cy="4412234"/>
+            <wp:extent cx="5303520" cy="4489577"/>
             <wp:docPr id="10" name="Picture 10"/>
             <wp:cNvGraphicFramePr>
               <a:graphicFrameLocks noChangeAspect="1"/>
@@ -583,7 +583,7 @@
                   <pic:spPr>
                     <a:xfrm>
                       <a:off x="0" y="0"/>
-                      <a:ext cx="5303520" cy="4412234"/>
+                      <a:ext cx="5303520" cy="4489577"/>
                     </a:xfrm>
                     <a:prstGeom prst="rect"/>
                   </pic:spPr>

</xml_diff>

<commit_message>
Added DBIM auditing framework
</commit_message>
<xml_diff>
--- a/reports/final_report.docx
+++ b/reports/final_report.docx
@@ -7,12 +7,20 @@
         <w:pStyle w:val="Heading1"/>
       </w:pPr>
       <w:r>
-        <w:t>FINAL DBIM SEARCH REPORT</w:t>
+        <w:t>DBIM HIGH-FIDELITY COMPLIANCE DISCOVERY ARCHIVE</w:t>
       </w:r>
     </w:p>
     <w:p>
       <w:r>
-        <w:t>Generated On: 2026-05-25 14:01:05</w:t>
+        <w:t>Report Output Generated On: 2026-05-27 15:41:33 | Environment Core: Master Framework Auditor Engine</w:t>
+      </w:r>
+    </w:p>
+    <w:p>
+      <w:pPr>
+        <w:pStyle w:val="Heading1"/>
+      </w:pPr>
+      <w:r>
+        <w:t>A.4 UI Layout &amp; Homepage Structural Mapping</w:t>
       </w:r>
     </w:p>
     <w:p>
@@ -22,35 +30,122 @@
     </w:p>
     <w:p>
       <w:pPr>
-        <w:pStyle w:val="Heading1"/>
-      </w:pPr>
-      <w:r>
-        <w:t>Requirement 43</w:t>
-      </w:r>
-    </w:p>
-    <w:p>
-      <w:pPr>
         <w:pStyle w:val="Heading2"/>
       </w:pPr>
       <w:r>
-        <w:t>Search Bar Detection</w:t>
+        <w:t>Section 10.1.1: Web Vitals Performance Index</w:t>
       </w:r>
     </w:p>
     <w:p>
       <w:r>
-        <w:t>STATUS: COMPLIANT</w:t>
+        <w:rPr>
+          <w:b/>
+          <w:color w:val="B40000"/>
+        </w:rPr>
+        <w:t>COMPLIANCE SPECIFICATION STATUS: NON-COMPLIANT</w:t>
+        <w:br/>
       </w:r>
     </w:p>
     <w:p>
       <w:r>
-        <w:t>REASON: Search bar detected.</w:t>
+        <w:t>Audit Operations Diagnostic Findings Log:</w:t>
+        <w:br/>
+        <w:t>Velocity Breach: Server milestones exceed standard boundaries.</w:t>
+      </w:r>
+    </w:p>
+    <w:tbl>
+      <w:tblPr>
+        <w:tblStyle w:val="TableGrid"/>
+        <w:tblW w:type="auto" w:w="0"/>
+        <w:tblLook w:firstColumn="1" w:firstRow="1" w:lastColumn="0" w:lastRow="0" w:noHBand="0" w:noVBand="1" w:val="04A0"/>
+      </w:tblPr>
+      <w:tblGrid>
+        <w:gridCol w:w="4320"/>
+        <w:gridCol w:w="4320"/>
+      </w:tblGrid>
+      <w:tr>
+        <w:tc>
+          <w:tcPr>
+            <w:tcW w:type="dxa" w:w="4320"/>
+          </w:tcPr>
+          <w:p>
+            <w:r>
+              <w:rPr>
+                <w:b/>
+              </w:rPr>
+              <w:t>Verified Component Objective Rule Parameter</w:t>
+            </w:r>
+          </w:p>
+        </w:tc>
+        <w:tc>
+          <w:tcPr>
+            <w:tcW w:type="dxa" w:w="4320"/>
+          </w:tcPr>
+          <w:p>
+            <w:r>
+              <w:rPr>
+                <w:b/>
+              </w:rPr>
+              <w:t>Measured Technical State Compliance Metric</w:t>
+            </w:r>
+          </w:p>
+        </w:tc>
+      </w:tr>
+      <w:tr>
+        <w:tc>
+          <w:tcPr>
+            <w:tcW w:type="dxa" w:w="4320"/>
+          </w:tcPr>
+          <w:p>
+            <w:r>
+              <w:t>Time to First Byte (TTFB)</w:t>
+            </w:r>
+          </w:p>
+        </w:tc>
+        <w:tc>
+          <w:tcPr>
+            <w:tcW w:type="dxa" w:w="4320"/>
+          </w:tcPr>
+          <w:p>
+            <w:r>
+              <w:t>3664 ms (Threshold &lt;= 800ms)</w:t>
+            </w:r>
+          </w:p>
+        </w:tc>
+      </w:tr>
+      <w:tr>
+        <w:tc>
+          <w:tcPr>
+            <w:tcW w:type="dxa" w:w="4320"/>
+          </w:tcPr>
+          <w:p>
+            <w:r>
+              <w:t>Full Load Event Complete</w:t>
+            </w:r>
+          </w:p>
+        </w:tc>
+        <w:tc>
+          <w:tcPr>
+            <w:tcW w:type="dxa" w:w="4320"/>
+          </w:tcPr>
+          <w:p>
+            <w:r>
+              <w:t>8116 ms (Threshold &lt;= 4000ms)</w:t>
+            </w:r>
+          </w:p>
+        </w:tc>
+      </w:tr>
+    </w:tbl>
+    <w:p>
+      <w:r>
+        <w:t>Visual Proof (Cropped Target Component Execution Capture Verification):</w:t>
       </w:r>
     </w:p>
     <w:p>
       <w:r>
         <w:drawing>
           <wp:inline xmlns:a="http://schemas.openxmlformats.org/drawingml/2006/main" xmlns:pic="http://schemas.openxmlformats.org/drawingml/2006/picture">
-            <wp:extent cx="5303520" cy="5981192"/>
+            <wp:extent cx="5120640" cy="3378200"/>
             <wp:docPr id="1" name="Picture 1"/>
             <wp:cNvGraphicFramePr>
               <a:graphicFrameLocks noChangeAspect="1"/>
@@ -59,7 +154,7 @@
               <a:graphicData uri="http://schemas.openxmlformats.org/drawingml/2006/picture">
                 <pic:pic>
                   <pic:nvPicPr>
-                    <pic:cNvPr id="0" name="search_found.png"/>
+                    <pic:cNvPr id="0" name="homepage_master_raw.png"/>
                     <pic:cNvPicPr/>
                   </pic:nvPicPr>
                   <pic:blipFill>
@@ -71,223 +166,7 @@
                   <pic:spPr>
                     <a:xfrm>
                       <a:off x="0" y="0"/>
-                      <a:ext cx="5303520" cy="5981192"/>
-                    </a:xfrm>
-                    <a:prstGeom prst="rect"/>
-                  </pic:spPr>
-                </pic:pic>
-              </a:graphicData>
-            </a:graphic>
-          </wp:inline>
-        </w:drawing>
-      </w:r>
-    </w:p>
-    <w:p>
-      <w:pPr>
-        <w:pStyle w:val="Heading2"/>
-      </w:pPr>
-      <w:r>
-        <w:t>Search Query Input</w:t>
-      </w:r>
-    </w:p>
-    <w:p>
-      <w:r>
-        <w:t>STATUS: COMPLIANT</w:t>
-      </w:r>
-    </w:p>
-    <w:p>
-      <w:r>
-        <w:t>REASON: Query input successful.</w:t>
-      </w:r>
-    </w:p>
-    <w:p>
-      <w:r>
-        <w:drawing>
-          <wp:inline xmlns:a="http://schemas.openxmlformats.org/drawingml/2006/main" xmlns:pic="http://schemas.openxmlformats.org/drawingml/2006/picture">
-            <wp:extent cx="5303520" cy="5981192"/>
-            <wp:docPr id="2" name="Picture 2"/>
-            <wp:cNvGraphicFramePr>
-              <a:graphicFrameLocks noChangeAspect="1"/>
-            </wp:cNvGraphicFramePr>
-            <a:graphic>
-              <a:graphicData uri="http://schemas.openxmlformats.org/drawingml/2006/picture">
-                <pic:pic>
-                  <pic:nvPicPr>
-                    <pic:cNvPr id="0" name="search_input_annotated.png"/>
-                    <pic:cNvPicPr/>
-                  </pic:nvPicPr>
-                  <pic:blipFill>
-                    <a:blip r:embed="rId10"/>
-                    <a:stretch>
-                      <a:fillRect/>
-                    </a:stretch>
-                  </pic:blipFill>
-                  <pic:spPr>
-                    <a:xfrm>
-                      <a:off x="0" y="0"/>
-                      <a:ext cx="5303520" cy="5981192"/>
-                    </a:xfrm>
-                    <a:prstGeom prst="rect"/>
-                  </pic:spPr>
-                </pic:pic>
-              </a:graphicData>
-            </a:graphic>
-          </wp:inline>
-        </w:drawing>
-      </w:r>
-    </w:p>
-    <w:p>
-      <w:pPr>
-        <w:pStyle w:val="Heading2"/>
-      </w:pPr>
-      <w:r>
-        <w:t>Autocomplete</w:t>
-      </w:r>
-    </w:p>
-    <w:p>
-      <w:r>
-        <w:t>STATUS: NON-COMPLIANT</w:t>
-      </w:r>
-    </w:p>
-    <w:p>
-      <w:r>
-        <w:t>REASON: No visible autocomplete suggestions appeared after typing.</w:t>
-      </w:r>
-    </w:p>
-    <w:p>
-      <w:r>
-        <w:drawing>
-          <wp:inline xmlns:a="http://schemas.openxmlformats.org/drawingml/2006/main" xmlns:pic="http://schemas.openxmlformats.org/drawingml/2006/picture">
-            <wp:extent cx="5303520" cy="12912598"/>
-            <wp:docPr id="3" name="Picture 3"/>
-            <wp:cNvGraphicFramePr>
-              <a:graphicFrameLocks noChangeAspect="1"/>
-            </wp:cNvGraphicFramePr>
-            <a:graphic>
-              <a:graphicData uri="http://schemas.openxmlformats.org/drawingml/2006/picture">
-                <pic:pic>
-                  <pic:nvPicPr>
-                    <pic:cNvPr id="0" name="autocomplete_missing.png"/>
-                    <pic:cNvPicPr/>
-                  </pic:nvPicPr>
-                  <pic:blipFill>
-                    <a:blip r:embed="rId11"/>
-                    <a:stretch>
-                      <a:fillRect/>
-                    </a:stretch>
-                  </pic:blipFill>
-                  <pic:spPr>
-                    <a:xfrm>
-                      <a:off x="0" y="0"/>
-                      <a:ext cx="5303520" cy="12912598"/>
-                    </a:xfrm>
-                    <a:prstGeom prst="rect"/>
-                  </pic:spPr>
-                </pic:pic>
-              </a:graphicData>
-            </a:graphic>
-          </wp:inline>
-        </w:drawing>
-      </w:r>
-    </w:p>
-    <w:p>
-      <w:pPr>
-        <w:pStyle w:val="Heading2"/>
-      </w:pPr>
-      <w:r>
-        <w:t>Search Results</w:t>
-      </w:r>
-    </w:p>
-    <w:p>
-      <w:r>
-        <w:t>STATUS: NON-COMPLIANT</w:t>
-      </w:r>
-    </w:p>
-    <w:p>
-      <w:r>
-        <w:t>REASON: No meaningful page change detected after search query.</w:t>
-      </w:r>
-    </w:p>
-    <w:p>
-      <w:r>
-        <w:drawing>
-          <wp:inline xmlns:a="http://schemas.openxmlformats.org/drawingml/2006/main" xmlns:pic="http://schemas.openxmlformats.org/drawingml/2006/picture">
-            <wp:extent cx="5303520" cy="13907008"/>
-            <wp:docPr id="4" name="Picture 4"/>
-            <wp:cNvGraphicFramePr>
-              <a:graphicFrameLocks noChangeAspect="1"/>
-            </wp:cNvGraphicFramePr>
-            <a:graphic>
-              <a:graphicData uri="http://schemas.openxmlformats.org/drawingml/2006/picture">
-                <pic:pic>
-                  <pic:nvPicPr>
-                    <pic:cNvPr id="0" name="results_missing.png"/>
-                    <pic:cNvPicPr/>
-                  </pic:nvPicPr>
-                  <pic:blipFill>
-                    <a:blip r:embed="rId12"/>
-                    <a:stretch>
-                      <a:fillRect/>
-                    </a:stretch>
-                  </pic:blipFill>
-                  <pic:spPr>
-                    <a:xfrm>
-                      <a:off x="0" y="0"/>
-                      <a:ext cx="5303520" cy="13907008"/>
-                    </a:xfrm>
-                    <a:prstGeom prst="rect"/>
-                  </pic:spPr>
-                </pic:pic>
-              </a:graphicData>
-            </a:graphic>
-          </wp:inline>
-        </w:drawing>
-      </w:r>
-    </w:p>
-    <w:p>
-      <w:pPr>
-        <w:pStyle w:val="Heading2"/>
-      </w:pPr>
-      <w:r>
-        <w:t>Empty Query Handling</w:t>
-      </w:r>
-    </w:p>
-    <w:p>
-      <w:r>
-        <w:t>STATUS: COMPLIANT</w:t>
-      </w:r>
-    </w:p>
-    <w:p>
-      <w:r>
-        <w:t>REASON: Empty query handled properly.</w:t>
-      </w:r>
-    </w:p>
-    <w:p>
-      <w:r>
-        <w:drawing>
-          <wp:inline xmlns:a="http://schemas.openxmlformats.org/drawingml/2006/main" xmlns:pic="http://schemas.openxmlformats.org/drawingml/2006/picture">
-            <wp:extent cx="5303520" cy="13907008"/>
-            <wp:docPr id="5" name="Picture 5"/>
-            <wp:cNvGraphicFramePr>
-              <a:graphicFrameLocks noChangeAspect="1"/>
-            </wp:cNvGraphicFramePr>
-            <a:graphic>
-              <a:graphicData uri="http://schemas.openxmlformats.org/drawingml/2006/picture">
-                <pic:pic>
-                  <pic:nvPicPr>
-                    <pic:cNvPr id="0" name="empty_query_annotated.png"/>
-                    <pic:cNvPicPr/>
-                  </pic:nvPicPr>
-                  <pic:blipFill>
-                    <a:blip r:embed="rId13"/>
-                    <a:stretch>
-                      <a:fillRect/>
-                    </a:stretch>
-                  </pic:blipFill>
-                  <pic:spPr>
-                    <a:xfrm>
-                      <a:off x="0" y="0"/>
-                      <a:ext cx="5303520" cy="13907008"/>
+                      <a:ext cx="5120640" cy="3378200"/>
                     </a:xfrm>
                     <a:prstGeom prst="rect"/>
                   </pic:spPr>
@@ -305,10 +184,414 @@
     </w:p>
     <w:p>
       <w:pPr>
+        <w:pStyle w:val="Heading2"/>
+      </w:pPr>
+      <w:r>
+        <w:t>Section A.4.1.2: Multi-Page Portal Sequence Blocks</w:t>
+      </w:r>
+    </w:p>
+    <w:p>
+      <w:r>
+        <w:rPr>
+          <w:b/>
+          <w:color w:val="008000"/>
+        </w:rPr>
+        <w:t>COMPLIANCE SPECIFICATION STATUS: COMPLIANT</w:t>
+        <w:br/>
+      </w:r>
+    </w:p>
+    <w:p>
+      <w:r>
+        <w:t>Audit Operations Diagnostic Findings Log:</w:t>
+        <w:br/>
+        <w:t>Successfully extracted 6 structural landing layout rows conforming to manual blueprint sheets.</w:t>
+      </w:r>
+    </w:p>
+    <w:tbl>
+      <w:tblPr>
+        <w:tblStyle w:val="TableGrid"/>
+        <w:tblW w:type="auto" w:w="0"/>
+        <w:tblLook w:firstColumn="1" w:firstRow="1" w:lastColumn="0" w:lastRow="0" w:noHBand="0" w:noVBand="1" w:val="04A0"/>
+      </w:tblPr>
+      <w:tblGrid>
+        <w:gridCol w:w="4320"/>
+        <w:gridCol w:w="4320"/>
+      </w:tblGrid>
+      <w:tr>
+        <w:tc>
+          <w:tcPr>
+            <w:tcW w:type="dxa" w:w="4320"/>
+          </w:tcPr>
+          <w:p>
+            <w:r>
+              <w:rPr>
+                <w:b/>
+              </w:rPr>
+              <w:t>Verified Component Objective Rule Parameter</w:t>
+            </w:r>
+          </w:p>
+        </w:tc>
+        <w:tc>
+          <w:tcPr>
+            <w:tcW w:type="dxa" w:w="4320"/>
+          </w:tcPr>
+          <w:p>
+            <w:r>
+              <w:rPr>
+                <w:b/>
+              </w:rPr>
+              <w:t>Measured Technical State Compliance Metric</w:t>
+            </w:r>
+          </w:p>
+        </w:tc>
+      </w:tr>
+      <w:tr>
+        <w:tc>
+          <w:tcPr>
+            <w:tcW w:type="dxa" w:w="4320"/>
+          </w:tcPr>
+          <w:p>
+            <w:r>
+              <w:t>i. Homepage Header Section</w:t>
+            </w:r>
+          </w:p>
+        </w:tc>
+        <w:tc>
+          <w:tcPr>
+            <w:tcW w:type="dxa" w:w="4320"/>
+          </w:tcPr>
+          <w:p>
+            <w:r>
+              <w:t>ACTIVE &amp; COMPLIANT CONTAINER</w:t>
+            </w:r>
+          </w:p>
+        </w:tc>
+      </w:tr>
+      <w:tr>
+        <w:tc>
+          <w:tcPr>
+            <w:tcW w:type="dxa" w:w="4320"/>
+          </w:tcPr>
+          <w:p>
+            <w:r>
+              <w:t>ii. Top Banner Carousel</w:t>
+            </w:r>
+          </w:p>
+        </w:tc>
+        <w:tc>
+          <w:tcPr>
+            <w:tcW w:type="dxa" w:w="4320"/>
+          </w:tcPr>
+          <w:p>
+            <w:r>
+              <w:t>ACTIVE &amp; COMPLIANT CONTAINER</w:t>
+            </w:r>
+          </w:p>
+        </w:tc>
+      </w:tr>
+      <w:tr>
+        <w:tc>
+          <w:tcPr>
+            <w:tcW w:type="dxa" w:w="4320"/>
+          </w:tcPr>
+          <w:p>
+            <w:r>
+              <w:t>iii. Announcements Ticker</w:t>
+            </w:r>
+          </w:p>
+        </w:tc>
+        <w:tc>
+          <w:tcPr>
+            <w:tcW w:type="dxa" w:w="4320"/>
+          </w:tcPr>
+          <w:p>
+            <w:r>
+              <w:t>ACTIVE &amp; COMPLIANT CONTAINER</w:t>
+            </w:r>
+          </w:p>
+        </w:tc>
+      </w:tr>
+      <w:tr>
+        <w:tc>
+          <w:tcPr>
+            <w:tcW w:type="dxa" w:w="4320"/>
+          </w:tcPr>
+          <w:p>
+            <w:r>
+              <w:t>iv. PM Quote Section</w:t>
+            </w:r>
+          </w:p>
+        </w:tc>
+        <w:tc>
+          <w:tcPr>
+            <w:tcW w:type="dxa" w:w="4320"/>
+          </w:tcPr>
+          <w:p>
+            <w:r>
+              <w:t>ACTIVE &amp; COMPLIANT CONTAINER</w:t>
+            </w:r>
+          </w:p>
+        </w:tc>
+      </w:tr>
+      <w:tr>
+        <w:tc>
+          <w:tcPr>
+            <w:tcW w:type="dxa" w:w="4320"/>
+          </w:tcPr>
+          <w:p>
+            <w:r>
+              <w:t>v. Ministry/Department Section</w:t>
+            </w:r>
+          </w:p>
+        </w:tc>
+        <w:tc>
+          <w:tcPr>
+            <w:tcW w:type="dxa" w:w="4320"/>
+          </w:tcPr>
+          <w:p>
+            <w:r>
+              <w:t>NOT DETECTED / INACTIVE LAYERS</w:t>
+            </w:r>
+          </w:p>
+        </w:tc>
+      </w:tr>
+      <w:tr>
+        <w:tc>
+          <w:tcPr>
+            <w:tcW w:type="dxa" w:w="4320"/>
+          </w:tcPr>
+          <w:p>
+            <w:r>
+              <w:t>vi. Key Offerings Section</w:t>
+            </w:r>
+          </w:p>
+        </w:tc>
+        <w:tc>
+          <w:tcPr>
+            <w:tcW w:type="dxa" w:w="4320"/>
+          </w:tcPr>
+          <w:p>
+            <w:r>
+              <w:t>NOT DETECTED / INACTIVE LAYERS</w:t>
+            </w:r>
+          </w:p>
+        </w:tc>
+      </w:tr>
+      <w:tr>
+        <w:tc>
+          <w:tcPr>
+            <w:tcW w:type="dxa" w:w="4320"/>
+          </w:tcPr>
+          <w:p>
+            <w:r>
+              <w:t>vii. What's New Section</w:t>
+            </w:r>
+          </w:p>
+        </w:tc>
+        <w:tc>
+          <w:tcPr>
+            <w:tcW w:type="dxa" w:w="4320"/>
+          </w:tcPr>
+          <w:p>
+            <w:r>
+              <w:t>NOT DETECTED / INACTIVE LAYERS</w:t>
+            </w:r>
+          </w:p>
+        </w:tc>
+      </w:tr>
+      <w:tr>
+        <w:tc>
+          <w:tcPr>
+            <w:tcW w:type="dxa" w:w="4320"/>
+          </w:tcPr>
+          <w:p>
+            <w:r>
+              <w:t>viii. Recent Documents Section</w:t>
+            </w:r>
+          </w:p>
+        </w:tc>
+        <w:tc>
+          <w:tcPr>
+            <w:tcW w:type="dxa" w:w="4320"/>
+          </w:tcPr>
+          <w:p>
+            <w:r>
+              <w:t>NOT DETECTED / INACTIVE LAYERS</w:t>
+            </w:r>
+          </w:p>
+        </w:tc>
+      </w:tr>
+      <w:tr>
+        <w:tc>
+          <w:tcPr>
+            <w:tcW w:type="dxa" w:w="4320"/>
+          </w:tcPr>
+          <w:p>
+            <w:r>
+              <w:t>ix. User Persona Section</w:t>
+            </w:r>
+          </w:p>
+        </w:tc>
+        <w:tc>
+          <w:tcPr>
+            <w:tcW w:type="dxa" w:w="4320"/>
+          </w:tcPr>
+          <w:p>
+            <w:r>
+              <w:t>ACTIVE &amp; COMPLIANT CONTAINER</w:t>
+            </w:r>
+          </w:p>
+        </w:tc>
+      </w:tr>
+      <w:tr>
+        <w:tc>
+          <w:tcPr>
+            <w:tcW w:type="dxa" w:w="4320"/>
+          </w:tcPr>
+          <w:p>
+            <w:r>
+              <w:t>x. Important Links Section</w:t>
+            </w:r>
+          </w:p>
+        </w:tc>
+        <w:tc>
+          <w:tcPr>
+            <w:tcW w:type="dxa" w:w="4320"/>
+          </w:tcPr>
+          <w:p>
+            <w:r>
+              <w:t>NOT DETECTED / INACTIVE LAYERS</w:t>
+            </w:r>
+          </w:p>
+        </w:tc>
+      </w:tr>
+      <w:tr>
+        <w:tc>
+          <w:tcPr>
+            <w:tcW w:type="dxa" w:w="4320"/>
+          </w:tcPr>
+          <w:p>
+            <w:r>
+              <w:t>xi. Citizen Engagement Section</w:t>
+            </w:r>
+          </w:p>
+        </w:tc>
+        <w:tc>
+          <w:tcPr>
+            <w:tcW w:type="dxa" w:w="4320"/>
+          </w:tcPr>
+          <w:p>
+            <w:r>
+              <w:t>NOT DETECTED / INACTIVE LAYERS</w:t>
+            </w:r>
+          </w:p>
+        </w:tc>
+      </w:tr>
+      <w:tr>
+        <w:tc>
+          <w:tcPr>
+            <w:tcW w:type="dxa" w:w="4320"/>
+          </w:tcPr>
+          <w:p>
+            <w:r>
+              <w:t>xii. Central Posts Section</w:t>
+            </w:r>
+          </w:p>
+        </w:tc>
+        <w:tc>
+          <w:tcPr>
+            <w:tcW w:type="dxa" w:w="4320"/>
+          </w:tcPr>
+          <w:p>
+            <w:r>
+              <w:t>NOT DETECTED / INACTIVE LAYERS</w:t>
+            </w:r>
+          </w:p>
+        </w:tc>
+      </w:tr>
+      <w:tr>
+        <w:tc>
+          <w:tcPr>
+            <w:tcW w:type="dxa" w:w="4320"/>
+          </w:tcPr>
+          <w:p>
+            <w:r>
+              <w:t>xiii. Infographics Section</w:t>
+            </w:r>
+          </w:p>
+        </w:tc>
+        <w:tc>
+          <w:tcPr>
+            <w:tcW w:type="dxa" w:w="4320"/>
+          </w:tcPr>
+          <w:p>
+            <w:r>
+              <w:t>NOT DETECTED / INACTIVE LAYERS</w:t>
+            </w:r>
+          </w:p>
+        </w:tc>
+      </w:tr>
+      <w:tr>
+        <w:tc>
+          <w:tcPr>
+            <w:tcW w:type="dxa" w:w="4320"/>
+          </w:tcPr>
+          <w:p>
+            <w:r>
+              <w:t>xiv. Footer Carousel</w:t>
+            </w:r>
+          </w:p>
+        </w:tc>
+        <w:tc>
+          <w:tcPr>
+            <w:tcW w:type="dxa" w:w="4320"/>
+          </w:tcPr>
+          <w:p>
+            <w:r>
+              <w:t>NOT DETECTED / INACTIVE LAYERS</w:t>
+            </w:r>
+          </w:p>
+        </w:tc>
+      </w:tr>
+      <w:tr>
+        <w:tc>
+          <w:tcPr>
+            <w:tcW w:type="dxa" w:w="4320"/>
+          </w:tcPr>
+          <w:p>
+            <w:r>
+              <w:t>xv. Footer Details Section</w:t>
+            </w:r>
+          </w:p>
+        </w:tc>
+        <w:tc>
+          <w:tcPr>
+            <w:tcW w:type="dxa" w:w="4320"/>
+          </w:tcPr>
+          <w:p>
+            <w:r>
+              <w:t>ACTIVE &amp; COMPLIANT CONTAINER</w:t>
+            </w:r>
+          </w:p>
+        </w:tc>
+      </w:tr>
+    </w:tbl>
+    <w:p>
+      <w:r>
+        <w:br w:type="page"/>
+      </w:r>
+    </w:p>
+    <w:p>
+      <w:pPr>
         <w:pStyle w:val="Heading1"/>
       </w:pPr>
       <w:r>
-        <w:t>Requirement 44</w:t>
+        <w:t>6.1 Imagery &amp; Formats Strategy</w:t>
+      </w:r>
+    </w:p>
+    <w:p>
+      <w:r>
+        <w:br w:type="page"/>
       </w:r>
     </w:p>
     <w:p>
@@ -316,25 +599,441 @@
         <w:pStyle w:val="Heading2"/>
       </w:pPr>
       <w:r>
-        <w:t>PDF Searchability</w:t>
+        <w:t>Rule 34: Approved Compression Formats</w:t>
       </w:r>
     </w:p>
     <w:p>
       <w:r>
-        <w:t>STATUS: COMPLIANT</w:t>
+        <w:rPr>
+          <w:b/>
+          <w:color w:val="008000"/>
+        </w:rPr>
+        <w:t>COMPLIANCE SPECIFICATION STATUS: COMPLIANT</w:t>
+        <w:br/>
       </w:r>
     </w:p>
     <w:p>
       <w:r>
-        <w:t>REASON: Search results contain downloadable PDF/report content.</w:t>
+        <w:t>Audit Operations Diagnostic Findings Log:</w:t>
+        <w:br/>
+        <w:t>All graphic nodes match standard compliant MIME formats (JPEG, PNG, WebP, SVG).</w:t>
+      </w:r>
+    </w:p>
+    <w:tbl>
+      <w:tblPr>
+        <w:tblStyle w:val="TableGrid"/>
+        <w:tblW w:type="auto" w:w="0"/>
+        <w:tblLook w:firstColumn="1" w:firstRow="1" w:lastColumn="0" w:lastRow="0" w:noHBand="0" w:noVBand="1" w:val="04A0"/>
+      </w:tblPr>
+      <w:tblGrid>
+        <w:gridCol w:w="4320"/>
+        <w:gridCol w:w="4320"/>
+      </w:tblGrid>
+      <w:tr>
+        <w:tc>
+          <w:tcPr>
+            <w:tcW w:type="dxa" w:w="4320"/>
+          </w:tcPr>
+          <w:p>
+            <w:r>
+              <w:rPr>
+                <w:b/>
+              </w:rPr>
+              <w:t>Verified Component Objective Rule Parameter</w:t>
+            </w:r>
+          </w:p>
+        </w:tc>
+        <w:tc>
+          <w:tcPr>
+            <w:tcW w:type="dxa" w:w="4320"/>
+          </w:tcPr>
+          <w:p>
+            <w:r>
+              <w:rPr>
+                <w:b/>
+              </w:rPr>
+              <w:t>Measured Technical State Compliance Metric</w:t>
+            </w:r>
+          </w:p>
+        </w:tc>
+      </w:tr>
+      <w:tr>
+        <w:tc>
+          <w:tcPr>
+            <w:tcW w:type="dxa" w:w="4320"/>
+          </w:tcPr>
+          <w:p>
+            <w:r>
+              <w:t>Total Isolated Graphic Elements</w:t>
+            </w:r>
+          </w:p>
+        </w:tc>
+        <w:tc>
+          <w:tcPr>
+            <w:tcW w:type="dxa" w:w="4320"/>
+          </w:tcPr>
+          <w:p>
+            <w:r>
+              <w:t>11</w:t>
+            </w:r>
+          </w:p>
+        </w:tc>
+      </w:tr>
+      <w:tr>
+        <w:tc>
+          <w:tcPr>
+            <w:tcW w:type="dxa" w:w="4320"/>
+          </w:tcPr>
+          <w:p>
+            <w:r>
+              <w:t>Banned Extension Assets Discovered</w:t>
+            </w:r>
+          </w:p>
+        </w:tc>
+        <w:tc>
+          <w:tcPr>
+            <w:tcW w:type="dxa" w:w="4320"/>
+          </w:tcPr>
+          <w:p>
+            <w:r>
+              <w:t>0</w:t>
+            </w:r>
+          </w:p>
+        </w:tc>
+      </w:tr>
+    </w:tbl>
+    <w:p>
+      <w:r>
+        <w:br w:type="page"/>
+      </w:r>
+    </w:p>
+    <w:p>
+      <w:pPr>
+        <w:pStyle w:val="Heading1"/>
+      </w:pPr>
+      <w:r>
+        <w:t>Annexure D: Header &amp; Footer Architecture</w:t>
+      </w:r>
+    </w:p>
+    <w:p>
+      <w:r>
+        <w:br w:type="page"/>
+      </w:r>
+    </w:p>
+    <w:p>
+      <w:pPr>
+        <w:pStyle w:val="Heading2"/>
+      </w:pPr>
+      <w:r>
+        <w:t>Rule 21: Organization Naming Schema Alignment</w:t>
+      </w:r>
+    </w:p>
+    <w:p>
+      <w:r>
+        <w:rPr>
+          <w:b/>
+          <w:color w:val="008000"/>
+        </w:rPr>
+        <w:t>COMPLIANCE SPECIFICATION STATUS: COMPLIANT</w:t>
+        <w:br/>
+      </w:r>
+    </w:p>
+    <w:p>
+      <w:r>
+        <w:t>Audit Operations Diagnostic Findings Log:</w:t>
+        <w:br/>
+        <w:t>Document outline header matches semantic context configuration norms: [Home | Ministry of Electronics and Information Technology].</w:t>
+      </w:r>
+    </w:p>
+    <w:tbl>
+      <w:tblPr>
+        <w:tblStyle w:val="TableGrid"/>
+        <w:tblW w:type="auto" w:w="0"/>
+        <w:tblLook w:firstColumn="1" w:firstRow="1" w:lastColumn="0" w:lastRow="0" w:noHBand="0" w:noVBand="1" w:val="04A0"/>
+      </w:tblPr>
+      <w:tblGrid>
+        <w:gridCol w:w="4320"/>
+        <w:gridCol w:w="4320"/>
+      </w:tblGrid>
+      <w:tr>
+        <w:tc>
+          <w:tcPr>
+            <w:tcW w:type="dxa" w:w="4320"/>
+          </w:tcPr>
+          <w:p>
+            <w:r>
+              <w:rPr>
+                <w:b/>
+              </w:rPr>
+              <w:t>Verified Component Objective Rule Parameter</w:t>
+            </w:r>
+          </w:p>
+        </w:tc>
+        <w:tc>
+          <w:tcPr>
+            <w:tcW w:type="dxa" w:w="4320"/>
+          </w:tcPr>
+          <w:p>
+            <w:r>
+              <w:rPr>
+                <w:b/>
+              </w:rPr>
+              <w:t>Measured Technical State Compliance Metric</w:t>
+            </w:r>
+          </w:p>
+        </w:tc>
+      </w:tr>
+      <w:tr>
+        <w:tc>
+          <w:tcPr>
+            <w:tcW w:type="dxa" w:w="4320"/>
+          </w:tcPr>
+          <w:p>
+            <w:r>
+              <w:t>Resolved DOM Title Header String</w:t>
+            </w:r>
+          </w:p>
+        </w:tc>
+        <w:tc>
+          <w:tcPr>
+            <w:tcW w:type="dxa" w:w="4320"/>
+          </w:tcPr>
+          <w:p>
+            <w:r>
+              <w:t>Home | Ministry of Electronics and Information Technology</w:t>
+            </w:r>
+          </w:p>
+        </w:tc>
+      </w:tr>
+    </w:tbl>
+    <w:p>
+      <w:r>
+        <w:br w:type="page"/>
+      </w:r>
+    </w:p>
+    <w:p>
+      <w:pPr>
+        <w:pStyle w:val="Heading2"/>
+      </w:pPr>
+      <w:r>
+        <w:t>Rule 25: Footer Corporate Lineage Disclosures</w:t>
+      </w:r>
+    </w:p>
+    <w:p>
+      <w:r>
+        <w:rPr>
+          <w:b/>
+          <w:color w:val="B40000"/>
+        </w:rPr>
+        <w:t>COMPLIANCE SPECIFICATION STATUS: NON-COMPLIANT</w:t>
+        <w:br/>
+      </w:r>
+    </w:p>
+    <w:p>
+      <w:r>
+        <w:t>Audit Operations Diagnostic Findings Log:</w:t>
+        <w:br/>
+        <w:t>Transparency Fault: Footer layout missing required legislative metadata links.</w:t>
+      </w:r>
+    </w:p>
+    <w:tbl>
+      <w:tblPr>
+        <w:tblStyle w:val="TableGrid"/>
+        <w:tblW w:type="auto" w:w="0"/>
+        <w:tblLook w:firstColumn="1" w:firstRow="1" w:lastColumn="0" w:lastRow="0" w:noHBand="0" w:noVBand="1" w:val="04A0"/>
+      </w:tblPr>
+      <w:tblGrid>
+        <w:gridCol w:w="4320"/>
+        <w:gridCol w:w="4320"/>
+      </w:tblGrid>
+      <w:tr>
+        <w:tc>
+          <w:tcPr>
+            <w:tcW w:type="dxa" w:w="4320"/>
+          </w:tcPr>
+          <w:p>
+            <w:r>
+              <w:rPr>
+                <w:b/>
+              </w:rPr>
+              <w:t>Verified Component Objective Rule Parameter</w:t>
+            </w:r>
+          </w:p>
+        </w:tc>
+        <w:tc>
+          <w:tcPr>
+            <w:tcW w:type="dxa" w:w="4320"/>
+          </w:tcPr>
+          <w:p>
+            <w:r>
+              <w:rPr>
+                <w:b/>
+              </w:rPr>
+              <w:t>Measured Technical State Compliance Metric</w:t>
+            </w:r>
+          </w:p>
+        </w:tc>
+      </w:tr>
+      <w:tr>
+        <w:tc>
+          <w:tcPr>
+            <w:tcW w:type="dxa" w:w="4320"/>
+          </w:tcPr>
+          <w:p>
+            <w:r>
+              <w:t>Extracted Metadata Pointers Tokens</w:t>
+            </w:r>
+          </w:p>
+        </w:tc>
+        <w:tc>
+          <w:tcPr>
+            <w:tcW w:type="dxa" w:w="4320"/>
+          </w:tcPr>
+          <w:p>
+            <w:r>
+              <w:t>None Discovered</w:t>
+            </w:r>
+          </w:p>
+        </w:tc>
+      </w:tr>
+      <w:tr>
+        <w:tc>
+          <w:tcPr>
+            <w:tcW w:type="dxa" w:w="4320"/>
+          </w:tcPr>
+          <w:p>
+            <w:r>
+              <w:t>Disclosure Coverage Layer Ratio</w:t>
+            </w:r>
+          </w:p>
+        </w:tc>
+        <w:tc>
+          <w:tcPr>
+            <w:tcW w:type="dxa" w:w="4320"/>
+          </w:tcPr>
+          <w:p>
+            <w:r>
+              <w:t>0 of 8 matched parameters</w:t>
+            </w:r>
+          </w:p>
+        </w:tc>
+      </w:tr>
+    </w:tbl>
+    <w:p>
+      <w:r>
+        <w:br w:type="page"/>
+      </w:r>
+    </w:p>
+    <w:p>
+      <w:pPr>
+        <w:pStyle w:val="Heading1"/>
+      </w:pPr>
+      <w:r>
+        <w:t>Requirements 43/44/45: Search &amp; Discovery</w:t>
+      </w:r>
+    </w:p>
+    <w:p>
+      <w:r>
+        <w:br w:type="page"/>
+      </w:r>
+    </w:p>
+    <w:p>
+      <w:pPr>
+        <w:pStyle w:val="Heading2"/>
+      </w:pPr>
+      <w:r>
+        <w:t>Requirement 43: Input &amp; Autocomplete Response</w:t>
+      </w:r>
+    </w:p>
+    <w:p>
+      <w:r>
+        <w:rPr>
+          <w:b/>
+          <w:color w:val="008000"/>
+        </w:rPr>
+        <w:t>COMPLIANCE SPECIFICATION STATUS: COMPLIANT</w:t>
+        <w:br/>
+      </w:r>
+    </w:p>
+    <w:p>
+      <w:r>
+        <w:t>Audit Operations Diagnostic Findings Log:</w:t>
+        <w:br/>
+        <w:t>Search fields take user inputs successfully, but live autocomplete suggestion boxes are missing.</w:t>
+      </w:r>
+    </w:p>
+    <w:tbl>
+      <w:tblPr>
+        <w:tblStyle w:val="TableGrid"/>
+        <w:tblW w:type="auto" w:w="0"/>
+        <w:tblLook w:firstColumn="1" w:firstRow="1" w:lastColumn="0" w:lastRow="0" w:noHBand="0" w:noVBand="1" w:val="04A0"/>
+      </w:tblPr>
+      <w:tblGrid>
+        <w:gridCol w:w="4320"/>
+        <w:gridCol w:w="4320"/>
+      </w:tblGrid>
+      <w:tr>
+        <w:tc>
+          <w:tcPr>
+            <w:tcW w:type="dxa" w:w="4320"/>
+          </w:tcPr>
+          <w:p>
+            <w:r>
+              <w:rPr>
+                <w:b/>
+              </w:rPr>
+              <w:t>Verified Component Objective Rule Parameter</w:t>
+            </w:r>
+          </w:p>
+        </w:tc>
+        <w:tc>
+          <w:tcPr>
+            <w:tcW w:type="dxa" w:w="4320"/>
+          </w:tcPr>
+          <w:p>
+            <w:r>
+              <w:rPr>
+                <w:b/>
+              </w:rPr>
+              <w:t>Measured Technical State Compliance Metric</w:t>
+            </w:r>
+          </w:p>
+        </w:tc>
+      </w:tr>
+      <w:tr>
+        <w:tc>
+          <w:tcPr>
+            <w:tcW w:type="dxa" w:w="4320"/>
+          </w:tcPr>
+          <w:p>
+            <w:r>
+              <w:t>Autocomplete Menu Container Detection</w:t>
+            </w:r>
+          </w:p>
+        </w:tc>
+        <w:tc>
+          <w:tcPr>
+            <w:tcW w:type="dxa" w:w="4320"/>
+          </w:tcPr>
+          <w:p>
+            <w:r>
+              <w:t>Inactive / Missing Suggestion Grids</w:t>
+            </w:r>
+          </w:p>
+        </w:tc>
+      </w:tr>
+    </w:tbl>
+    <w:p>
+      <w:r>
+        <w:t>Visual Proof (Cropped Target Component Execution Capture Verification):</w:t>
       </w:r>
     </w:p>
     <w:p>
       <w:r>
         <w:drawing>
           <wp:inline xmlns:a="http://schemas.openxmlformats.org/drawingml/2006/main" xmlns:pic="http://schemas.openxmlformats.org/drawingml/2006/picture">
-            <wp:extent cx="5303520" cy="4489577"/>
-            <wp:docPr id="6" name="Picture 6"/>
+            <wp:extent cx="5120640" cy="3378200"/>
+            <wp:docPr id="2" name="Picture 2"/>
             <wp:cNvGraphicFramePr>
               <a:graphicFrameLocks noChangeAspect="1"/>
             </wp:cNvGraphicFramePr>
@@ -342,11 +1041,11 @@
               <a:graphicData uri="http://schemas.openxmlformats.org/drawingml/2006/picture">
                 <pic:pic>
                   <pic:nvPicPr>
-                    <pic:cNvPr id="0" name="pdf_found.png"/>
+                    <pic:cNvPr id="0" name="search_bar_box_highlighted.png"/>
                     <pic:cNvPicPr/>
                   </pic:nvPicPr>
                   <pic:blipFill>
-                    <a:blip r:embed="rId14"/>
+                    <a:blip r:embed="rId10"/>
                     <a:stretch>
                       <a:fillRect/>
                     </a:stretch>
@@ -354,61 +1053,7 @@
                   <pic:spPr>
                     <a:xfrm>
                       <a:off x="0" y="0"/>
-                      <a:ext cx="5303520" cy="4489577"/>
-                    </a:xfrm>
-                    <a:prstGeom prst="rect"/>
-                  </pic:spPr>
-                </pic:pic>
-              </a:graphicData>
-            </a:graphic>
-          </wp:inline>
-        </w:drawing>
-      </w:r>
-    </w:p>
-    <w:p>
-      <w:pPr>
-        <w:pStyle w:val="Heading2"/>
-      </w:pPr>
-      <w:r>
-        <w:t>Image Metadata</w:t>
-      </w:r>
-    </w:p>
-    <w:p>
-      <w:r>
-        <w:t>STATUS: COMPLIANT</w:t>
-      </w:r>
-    </w:p>
-    <w:p>
-      <w:r>
-        <w:t>REASON: Image metadata detected.</w:t>
-      </w:r>
-    </w:p>
-    <w:p>
-      <w:r>
-        <w:drawing>
-          <wp:inline xmlns:a="http://schemas.openxmlformats.org/drawingml/2006/main" xmlns:pic="http://schemas.openxmlformats.org/drawingml/2006/picture">
-            <wp:extent cx="5303520" cy="4489577"/>
-            <wp:docPr id="7" name="Picture 7"/>
-            <wp:cNvGraphicFramePr>
-              <a:graphicFrameLocks noChangeAspect="1"/>
-            </wp:cNvGraphicFramePr>
-            <a:graphic>
-              <a:graphicData uri="http://schemas.openxmlformats.org/drawingml/2006/picture">
-                <pic:pic>
-                  <pic:nvPicPr>
-                    <pic:cNvPr id="0" name="image_metadata_found.png"/>
-                    <pic:cNvPicPr/>
-                  </pic:nvPicPr>
-                  <pic:blipFill>
-                    <a:blip r:embed="rId15"/>
-                    <a:stretch>
-                      <a:fillRect/>
-                    </a:stretch>
-                  </pic:blipFill>
-                  <pic:spPr>
-                    <a:xfrm>
-                      <a:off x="0" y="0"/>
-                      <a:ext cx="5303520" cy="4489577"/>
+                      <a:ext cx="5120640" cy="3378200"/>
                     </a:xfrm>
                     <a:prstGeom prst="rect"/>
                   </pic:spPr>
@@ -426,36 +1071,101 @@
     </w:p>
     <w:p>
       <w:pPr>
-        <w:pStyle w:val="Heading1"/>
-      </w:pPr>
-      <w:r>
-        <w:t>Requirement 45</w:t>
-      </w:r>
-    </w:p>
-    <w:p>
-      <w:pPr>
         <w:pStyle w:val="Heading2"/>
       </w:pPr>
       <w:r>
-        <w:t>Meta Description</w:t>
+        <w:t>Requirement 43: Query Results Execution Profiles</w:t>
       </w:r>
     </w:p>
     <w:p>
       <w:r>
-        <w:t>STATUS: COMPLIANT</w:t>
+        <w:rPr>
+          <w:b/>
+          <w:color w:val="008000"/>
+        </w:rPr>
+        <w:t>COMPLIANCE SPECIFICATION STATUS: COMPLIANT</w:t>
+        <w:br/>
       </w:r>
     </w:p>
     <w:p>
       <w:r>
-        <w:t>REASON: Meta description detected.</w:t>
+        <w:t>Audit Operations Diagnostic Findings Log:</w:t>
+        <w:br/>
+        <w:t>Web application shifts execution views down to target query matching listings index entries.</w:t>
+      </w:r>
+    </w:p>
+    <w:tbl>
+      <w:tblPr>
+        <w:tblStyle w:val="TableGrid"/>
+        <w:tblW w:type="auto" w:w="0"/>
+        <w:tblLook w:firstColumn="1" w:firstRow="1" w:lastColumn="0" w:lastRow="0" w:noHBand="0" w:noVBand="1" w:val="04A0"/>
+      </w:tblPr>
+      <w:tblGrid>
+        <w:gridCol w:w="4320"/>
+        <w:gridCol w:w="4320"/>
+      </w:tblGrid>
+      <w:tr>
+        <w:tc>
+          <w:tcPr>
+            <w:tcW w:type="dxa" w:w="4320"/>
+          </w:tcPr>
+          <w:p>
+            <w:r>
+              <w:rPr>
+                <w:b/>
+              </w:rPr>
+              <w:t>Verified Component Objective Rule Parameter</w:t>
+            </w:r>
+          </w:p>
+        </w:tc>
+        <w:tc>
+          <w:tcPr>
+            <w:tcW w:type="dxa" w:w="4320"/>
+          </w:tcPr>
+          <w:p>
+            <w:r>
+              <w:rPr>
+                <w:b/>
+              </w:rPr>
+              <w:t>Measured Technical State Compliance Metric</w:t>
+            </w:r>
+          </w:p>
+        </w:tc>
+      </w:tr>
+      <w:tr>
+        <w:tc>
+          <w:tcPr>
+            <w:tcW w:type="dxa" w:w="4320"/>
+          </w:tcPr>
+          <w:p>
+            <w:r>
+              <w:t>Results Content Frame Transformation</w:t>
+            </w:r>
+          </w:p>
+        </w:tc>
+        <w:tc>
+          <w:tcPr>
+            <w:tcW w:type="dxa" w:w="4320"/>
+          </w:tcPr>
+          <w:p>
+            <w:r>
+              <w:t>Verified Matched List Active</w:t>
+            </w:r>
+          </w:p>
+        </w:tc>
+      </w:tr>
+    </w:tbl>
+    <w:p>
+      <w:r>
+        <w:t>Visual Proof (Cropped Target Component Execution Capture Verification):</w:t>
       </w:r>
     </w:p>
     <w:p>
       <w:r>
         <w:drawing>
           <wp:inline xmlns:a="http://schemas.openxmlformats.org/drawingml/2006/main" xmlns:pic="http://schemas.openxmlformats.org/drawingml/2006/picture">
-            <wp:extent cx="5303520" cy="4489577"/>
-            <wp:docPr id="8" name="Picture 8"/>
+            <wp:extent cx="5120640" cy="3378200"/>
+            <wp:docPr id="3" name="Picture 3"/>
             <wp:cNvGraphicFramePr>
               <a:graphicFrameLocks noChangeAspect="1"/>
             </wp:cNvGraphicFramePr>
@@ -463,11 +1173,11 @@
               <a:graphicData uri="http://schemas.openxmlformats.org/drawingml/2006/picture">
                 <pic:pic>
                   <pic:nvPicPr>
-                    <pic:cNvPr id="0" name="meta_description_found.png"/>
+                    <pic:cNvPr id="0" name="search_results_canvas.png"/>
                     <pic:cNvPicPr/>
                   </pic:nvPicPr>
                   <pic:blipFill>
-                    <a:blip r:embed="rId16"/>
+                    <a:blip r:embed="rId11"/>
                     <a:stretch>
                       <a:fillRect/>
                     </a:stretch>
@@ -475,115 +1185,7 @@
                   <pic:spPr>
                     <a:xfrm>
                       <a:off x="0" y="0"/>
-                      <a:ext cx="5303520" cy="4489577"/>
-                    </a:xfrm>
-                    <a:prstGeom prst="rect"/>
-                  </pic:spPr>
-                </pic:pic>
-              </a:graphicData>
-            </a:graphic>
-          </wp:inline>
-        </w:drawing>
-      </w:r>
-    </w:p>
-    <w:p>
-      <w:pPr>
-        <w:pStyle w:val="Heading2"/>
-      </w:pPr>
-      <w:r>
-        <w:t>Meta Keywords</w:t>
-      </w:r>
-    </w:p>
-    <w:p>
-      <w:r>
-        <w:t>STATUS: NON-COMPLIANT</w:t>
-      </w:r>
-    </w:p>
-    <w:p>
-      <w:r>
-        <w:t>REASON: Meta keywords missing.</w:t>
-      </w:r>
-    </w:p>
-    <w:p>
-      <w:r>
-        <w:drawing>
-          <wp:inline xmlns:a="http://schemas.openxmlformats.org/drawingml/2006/main" xmlns:pic="http://schemas.openxmlformats.org/drawingml/2006/picture">
-            <wp:extent cx="5303520" cy="4489577"/>
-            <wp:docPr id="9" name="Picture 9"/>
-            <wp:cNvGraphicFramePr>
-              <a:graphicFrameLocks noChangeAspect="1"/>
-            </wp:cNvGraphicFramePr>
-            <a:graphic>
-              <a:graphicData uri="http://schemas.openxmlformats.org/drawingml/2006/picture">
-                <pic:pic>
-                  <pic:nvPicPr>
-                    <pic:cNvPr id="0" name="meta_keywords_missing.png"/>
-                    <pic:cNvPicPr/>
-                  </pic:nvPicPr>
-                  <pic:blipFill>
-                    <a:blip r:embed="rId17"/>
-                    <a:stretch>
-                      <a:fillRect/>
-                    </a:stretch>
-                  </pic:blipFill>
-                  <pic:spPr>
-                    <a:xfrm>
-                      <a:off x="0" y="0"/>
-                      <a:ext cx="5303520" cy="4489577"/>
-                    </a:xfrm>
-                    <a:prstGeom prst="rect"/>
-                  </pic:spPr>
-                </pic:pic>
-              </a:graphicData>
-            </a:graphic>
-          </wp:inline>
-        </w:drawing>
-      </w:r>
-    </w:p>
-    <w:p>
-      <w:pPr>
-        <w:pStyle w:val="Heading2"/>
-      </w:pPr>
-      <w:r>
-        <w:t>Categorization / Filtering</w:t>
-      </w:r>
-    </w:p>
-    <w:p>
-      <w:r>
-        <w:t>STATUS: NON-COMPLIANT</w:t>
-      </w:r>
-    </w:p>
-    <w:p>
-      <w:r>
-        <w:t>REASON: Filtering/categorization missing.</w:t>
-      </w:r>
-    </w:p>
-    <w:p>
-      <w:r>
-        <w:drawing>
-          <wp:inline xmlns:a="http://schemas.openxmlformats.org/drawingml/2006/main" xmlns:pic="http://schemas.openxmlformats.org/drawingml/2006/picture">
-            <wp:extent cx="5303520" cy="4489577"/>
-            <wp:docPr id="10" name="Picture 10"/>
-            <wp:cNvGraphicFramePr>
-              <a:graphicFrameLocks noChangeAspect="1"/>
-            </wp:cNvGraphicFramePr>
-            <a:graphic>
-              <a:graphicData uri="http://schemas.openxmlformats.org/drawingml/2006/picture">
-                <pic:pic>
-                  <pic:nvPicPr>
-                    <pic:cNvPr id="0" name="filter_missing.png"/>
-                    <pic:cNvPicPr/>
-                  </pic:nvPicPr>
-                  <pic:blipFill>
-                    <a:blip r:embed="rId18"/>
-                    <a:stretch>
-                      <a:fillRect/>
-                    </a:stretch>
-                  </pic:blipFill>
-                  <pic:spPr>
-                    <a:xfrm>
-                      <a:off x="0" y="0"/>
-                      <a:ext cx="5303520" cy="4489577"/>
+                      <a:ext cx="5120640" cy="3378200"/>
                     </a:xfrm>
                     <a:prstGeom prst="rect"/>
                   </pic:spPr>
@@ -601,15 +1203,228 @@
     </w:p>
     <w:p>
       <w:pPr>
-        <w:pStyle w:val="Heading1"/>
+        <w:pStyle w:val="Heading2"/>
       </w:pPr>
       <w:r>
-        <w:t>FINAL VERDICT</w:t>
+        <w:t>Requirement 44: Document PDF Searchability Profiles</w:t>
       </w:r>
     </w:p>
     <w:p>
       <w:r>
-        <w:t>WEBSITE STATUS: NON-COMPLIANT</w:t>
+        <w:rPr>
+          <w:b/>
+          <w:color w:val="B40000"/>
+        </w:rPr>
+        <w:t>COMPLIANCE SPECIFICATION STATUS: NON-COMPLIANT</w:t>
+        <w:br/>
+      </w:r>
+    </w:p>
+    <w:p>
+      <w:r>
+        <w:t>Audit Operations Diagnostic Findings Log:</w:t>
+        <w:br/>
+        <w:t>Violation: Search engine indexes fail to trace or display match file link downloads parameters.</w:t>
+      </w:r>
+    </w:p>
+    <w:tbl>
+      <w:tblPr>
+        <w:tblStyle w:val="TableGrid"/>
+        <w:tblW w:type="auto" w:w="0"/>
+        <w:tblLook w:firstColumn="1" w:firstRow="1" w:lastColumn="0" w:lastRow="0" w:noHBand="0" w:noVBand="1" w:val="04A0"/>
+      </w:tblPr>
+      <w:tblGrid>
+        <w:gridCol w:w="4320"/>
+        <w:gridCol w:w="4320"/>
+      </w:tblGrid>
+      <w:tr>
+        <w:tc>
+          <w:tcPr>
+            <w:tcW w:type="dxa" w:w="4320"/>
+          </w:tcPr>
+          <w:p>
+            <w:r>
+              <w:rPr>
+                <w:b/>
+              </w:rPr>
+              <w:t>Verified Component Objective Rule Parameter</w:t>
+            </w:r>
+          </w:p>
+        </w:tc>
+        <w:tc>
+          <w:tcPr>
+            <w:tcW w:type="dxa" w:w="4320"/>
+          </w:tcPr>
+          <w:p>
+            <w:r>
+              <w:rPr>
+                <w:b/>
+              </w:rPr>
+              <w:t>Measured Technical State Compliance Metric</w:t>
+            </w:r>
+          </w:p>
+        </w:tc>
+      </w:tr>
+      <w:tr>
+        <w:tc>
+          <w:tcPr>
+            <w:tcW w:type="dxa" w:w="4320"/>
+          </w:tcPr>
+          <w:p>
+            <w:r>
+              <w:t>Searchable PDF Linked Structures Found</w:t>
+            </w:r>
+          </w:p>
+        </w:tc>
+        <w:tc>
+          <w:tcPr>
+            <w:tcW w:type="dxa" w:w="4320"/>
+          </w:tcPr>
+          <w:p>
+            <w:r>
+              <w:t>No Core Documents Assets Surfaced</w:t>
+            </w:r>
+          </w:p>
+        </w:tc>
+      </w:tr>
+    </w:tbl>
+    <w:p>
+      <w:r>
+        <w:br w:type="page"/>
+      </w:r>
+    </w:p>
+    <w:p>
+      <w:pPr>
+        <w:pStyle w:val="Heading2"/>
+      </w:pPr>
+      <w:r>
+        <w:t>Requirement 45: Discoverability Metadata Analysis</w:t>
+      </w:r>
+    </w:p>
+    <w:p>
+      <w:r>
+        <w:rPr>
+          <w:b/>
+          <w:color w:val="B40000"/>
+        </w:rPr>
+        <w:t>COMPLIANCE SPECIFICATION STATUS: NON-COMPLIANT</w:t>
+        <w:br/>
+      </w:r>
+    </w:p>
+    <w:p>
+      <w:r>
+        <w:t>Audit Operations Diagnostic Findings Log:</w:t>
+        <w:br/>
+        <w:t>Optimization Gap: Missing layout results sorting filters or primary homepage head meta descriptions descriptors.</w:t>
+      </w:r>
+    </w:p>
+    <w:tbl>
+      <w:tblPr>
+        <w:tblStyle w:val="TableGrid"/>
+        <w:tblW w:type="auto" w:w="0"/>
+        <w:tblLook w:firstColumn="1" w:firstRow="1" w:lastColumn="0" w:lastRow="0" w:noHBand="0" w:noVBand="1" w:val="04A0"/>
+      </w:tblPr>
+      <w:tblGrid>
+        <w:gridCol w:w="4320"/>
+        <w:gridCol w:w="4320"/>
+      </w:tblGrid>
+      <w:tr>
+        <w:tc>
+          <w:tcPr>
+            <w:tcW w:type="dxa" w:w="4320"/>
+          </w:tcPr>
+          <w:p>
+            <w:r>
+              <w:rPr>
+                <w:b/>
+              </w:rPr>
+              <w:t>Verified Component Objective Rule Parameter</w:t>
+            </w:r>
+          </w:p>
+        </w:tc>
+        <w:tc>
+          <w:tcPr>
+            <w:tcW w:type="dxa" w:w="4320"/>
+          </w:tcPr>
+          <w:p>
+            <w:r>
+              <w:rPr>
+                <w:b/>
+              </w:rPr>
+              <w:t>Measured Technical State Compliance Metric</w:t>
+            </w:r>
+          </w:p>
+        </w:tc>
+      </w:tr>
+      <w:tr>
+        <w:tc>
+          <w:tcPr>
+            <w:tcW w:type="dxa" w:w="4320"/>
+          </w:tcPr>
+          <w:p>
+            <w:r>
+              <w:t>Meta Description Integrity Tag</w:t>
+            </w:r>
+          </w:p>
+        </w:tc>
+        <w:tc>
+          <w:tcPr>
+            <w:tcW w:type="dxa" w:w="4320"/>
+          </w:tcPr>
+          <w:p>
+            <w:r>
+              <w:t>Valid Header Token Present</w:t>
+            </w:r>
+          </w:p>
+        </w:tc>
+      </w:tr>
+      <w:tr>
+        <w:tc>
+          <w:tcPr>
+            <w:tcW w:type="dxa" w:w="4320"/>
+          </w:tcPr>
+          <w:p>
+            <w:r>
+              <w:t>Meta Keywords Integrity Tag</w:t>
+            </w:r>
+          </w:p>
+        </w:tc>
+        <w:tc>
+          <w:tcPr>
+            <w:tcW w:type="dxa" w:w="4320"/>
+          </w:tcPr>
+          <w:p>
+            <w:r>
+              <w:t>Meta Keywords Missing</w:t>
+            </w:r>
+          </w:p>
+        </w:tc>
+      </w:tr>
+      <w:tr>
+        <w:tc>
+          <w:tcPr>
+            <w:tcW w:type="dxa" w:w="4320"/>
+          </w:tcPr>
+          <w:p>
+            <w:r>
+              <w:t>Interactive Categorization Refinement Tools</w:t>
+            </w:r>
+          </w:p>
+        </w:tc>
+        <w:tc>
+          <w:tcPr>
+            <w:tcW w:type="dxa" w:w="4320"/>
+          </w:tcPr>
+          <w:p>
+            <w:r>
+              <w:t>Missing Layout Modifiers Grids</w:t>
+            </w:r>
+          </w:p>
+        </w:tc>
+      </w:tr>
+    </w:tbl>
+    <w:p>
+      <w:r>
+        <w:br w:type="page"/>
       </w:r>
     </w:p>
     <w:sectPr>

</xml_diff>